<commit_message>
BUG: Fix member list. Update readme.md dates to match CFP
</commit_message>
<xml_diff>
--- a/docs/Open-H-4D_Call_For_Proposals.docx
+++ b/docs/Open-H-4D_Call_For_Proposals.docx
@@ -579,7 +579,10 @@
         <w:ind w:left="270"/>
       </w:pPr>
       <w:r>
-        <w:t>Jeff Bodner, PhD</w:t>
+        <w:t>Jeff Bodner</w:t>
+      </w:r>
+      <w:r>
+        <w:tab/>
       </w:r>
       <w:r>
         <w:rPr>
@@ -604,7 +607,27 @@
         <w:ind w:left="270"/>
       </w:pPr>
       <w:r>
-        <w:t>Xiaoxiao Li, PhD</w:t>
+        <w:t>Ryan Moore, MD</w:t>
+      </w:r>
+      <w:r>
+        <w:tab/>
+      </w:r>
+      <w:r>
+        <w:tab/>
+        <w:t>Cincinnati Children’s Hospital</w:t>
+      </w:r>
+    </w:p>
+    <w:p>
+      <w:pPr>
+        <w:ind w:left="270"/>
+      </w:pPr>
+      <w:proofErr w:type="spellStart"/>
+      <w:r>
+        <w:t>Xiaoxiao</w:t>
+      </w:r>
+      <w:proofErr w:type="spellEnd"/>
+      <w:r>
+        <w:t xml:space="preserve"> Li, PhD</w:t>
       </w:r>
       <w:r>
         <w:tab/>
@@ -628,9 +651,11 @@
       <w:r>
         <w:t xml:space="preserve">The Open-H-4D dataset and model weights will be publicly available on Hugging Face under the </w:t>
       </w:r>
+      <w:proofErr w:type="spellStart"/>
       <w:r>
         <w:t>OpenMDW</w:t>
       </w:r>
+      <w:proofErr w:type="spellEnd"/>
       <w:r>
         <w:t xml:space="preserve"> license.</w:t>
       </w:r>
@@ -912,7 +937,21 @@
         <w:rPr>
           <w:color w:val="000000"/>
         </w:rPr>
-        <w:t>– Publish cleaned and pre-processed datasets and model weights under OpenMDW, with the first public release targeted for August 2027.</w:t>
+        <w:t xml:space="preserve">– Publish cleaned and pre-processed datasets and model weights under </w:t>
+      </w:r>
+      <w:proofErr w:type="spellStart"/>
+      <w:r>
+        <w:rPr>
+          <w:color w:val="000000"/>
+        </w:rPr>
+        <w:t>OpenMDW</w:t>
+      </w:r>
+      <w:proofErr w:type="spellEnd"/>
+      <w:r>
+        <w:rPr>
+          <w:color w:val="000000"/>
+        </w:rPr>
+        <w:t>, with the first public release targeted for August 2027.</w:t>
       </w:r>
     </w:p>
     <w:p>
@@ -2405,7 +2444,21 @@
         <w:rPr>
           <w:color w:val="000000"/>
         </w:rPr>
-        <w:t>Confirmation that contributed assets can be publicly released for academic and commercial use under OpenMDW. Identify the original data owner and any required third-party permissions, including when a vendor or intermediary supplies the data.</w:t>
+        <w:t xml:space="preserve">Confirmation that contributed assets can be publicly released for academic and commercial use under </w:t>
+      </w:r>
+      <w:proofErr w:type="spellStart"/>
+      <w:r>
+        <w:rPr>
+          <w:color w:val="000000"/>
+        </w:rPr>
+        <w:t>OpenMDW</w:t>
+      </w:r>
+      <w:proofErr w:type="spellEnd"/>
+      <w:r>
+        <w:rPr>
+          <w:color w:val="000000"/>
+        </w:rPr>
+        <w:t>. Identify the original data owner and any required third-party permissions, including when a vendor or intermediary supplies the data.</w:t>
       </w:r>
     </w:p>
     <w:p>
@@ -3151,7 +3204,21 @@
         <w:rPr>
           <w:color w:val="000000"/>
         </w:rPr>
-        <w:t>Final datasets and model weights will be released under OpenMDW (https://openmdw.ai/). Contributors must hold the rights needed to release each contributed asset under that license. This applies to original images, derived models, simulation outputs, and open-category data.</w:t>
+        <w:t xml:space="preserve">Final datasets and model weights will be released under </w:t>
+      </w:r>
+      <w:proofErr w:type="spellStart"/>
+      <w:r>
+        <w:rPr>
+          <w:color w:val="000000"/>
+        </w:rPr>
+        <w:t>OpenMDW</w:t>
+      </w:r>
+      <w:proofErr w:type="spellEnd"/>
+      <w:r>
+        <w:rPr>
+          <w:color w:val="000000"/>
+        </w:rPr>
+        <w:t xml:space="preserve"> (https://openmdw.ai/). Contributors must hold the rights needed to release each contributed asset under that license. This applies to original images, derived models, simulation outputs, and open-category data.</w:t>
       </w:r>
     </w:p>
     <w:p/>
@@ -4692,6 +4759,18 @@
       <w:tblStyleColBandSize w:val="1"/>
     </w:tblPr>
   </w:style>
+  <w:style w:type="character" w:styleId="FollowedHyperlink">
+    <w:name w:val="FollowedHyperlink"/>
+    <w:basedOn w:val="DefaultParagraphFont"/>
+    <w:uiPriority w:val="99"/>
+    <w:semiHidden/>
+    <w:unhideWhenUsed/>
+    <w:rsid w:val="002218CE"/>
+    <w:rPr>
+      <w:color w:val="96607D" w:themeColor="followedHyperlink"/>
+      <w:u w:val="single"/>
+    </w:rPr>
+  </w:style>
 </w:styles>
 </file>
 

</xml_diff>

<commit_message>
FIX: Update readme to match CFP
</commit_message>
<xml_diff>
--- a/docs/Open-H-4D_Call_For_Proposals.docx
+++ b/docs/Open-H-4D_Call_For_Proposals.docx
@@ -579,7 +579,10 @@
         <w:ind w:left="270"/>
       </w:pPr>
       <w:r>
-        <w:t>Jeff Bodner, PhD</w:t>
+        <w:t>Jeff Bodner</w:t>
+      </w:r>
+      <w:r>
+        <w:tab/>
       </w:r>
       <w:r>
         <w:rPr>
@@ -604,7 +607,27 @@
         <w:ind w:left="270"/>
       </w:pPr>
       <w:r>
-        <w:t>Xiaoxiao Li, PhD</w:t>
+        <w:t>Ryan Moore, MD</w:t>
+      </w:r>
+      <w:r>
+        <w:tab/>
+      </w:r>
+      <w:r>
+        <w:tab/>
+        <w:t>Cincinnati Children’s Hospital</w:t>
+      </w:r>
+    </w:p>
+    <w:p>
+      <w:pPr>
+        <w:ind w:left="270"/>
+      </w:pPr>
+      <w:proofErr w:type="spellStart"/>
+      <w:r>
+        <w:t>Xiaoxiao</w:t>
+      </w:r>
+      <w:proofErr w:type="spellEnd"/>
+      <w:r>
+        <w:t xml:space="preserve"> Li, PhD</w:t>
       </w:r>
       <w:r>
         <w:tab/>
@@ -628,9 +651,11 @@
       <w:r>
         <w:t xml:space="preserve">The Open-H-4D dataset and model weights will be publicly available on Hugging Face under the </w:t>
       </w:r>
+      <w:proofErr w:type="spellStart"/>
       <w:r>
         <w:t>OpenMDW</w:t>
       </w:r>
+      <w:proofErr w:type="spellEnd"/>
       <w:r>
         <w:t xml:space="preserve"> license.</w:t>
       </w:r>
@@ -912,7 +937,21 @@
         <w:rPr>
           <w:color w:val="000000"/>
         </w:rPr>
-        <w:t>– Publish cleaned and pre-processed datasets and model weights under OpenMDW, with the first public release targeted for August 2027.</w:t>
+        <w:t xml:space="preserve">– Publish cleaned and pre-processed datasets and model weights under </w:t>
+      </w:r>
+      <w:proofErr w:type="spellStart"/>
+      <w:r>
+        <w:rPr>
+          <w:color w:val="000000"/>
+        </w:rPr>
+        <w:t>OpenMDW</w:t>
+      </w:r>
+      <w:proofErr w:type="spellEnd"/>
+      <w:r>
+        <w:rPr>
+          <w:color w:val="000000"/>
+        </w:rPr>
+        <w:t>, with the first public release targeted for August 2027.</w:t>
       </w:r>
     </w:p>
     <w:p>
@@ -2405,7 +2444,21 @@
         <w:rPr>
           <w:color w:val="000000"/>
         </w:rPr>
-        <w:t>Confirmation that contributed assets can be publicly released for academic and commercial use under OpenMDW. Identify the original data owner and any required third-party permissions, including when a vendor or intermediary supplies the data.</w:t>
+        <w:t xml:space="preserve">Confirmation that contributed assets can be publicly released for academic and commercial use under </w:t>
+      </w:r>
+      <w:proofErr w:type="spellStart"/>
+      <w:r>
+        <w:rPr>
+          <w:color w:val="000000"/>
+        </w:rPr>
+        <w:t>OpenMDW</w:t>
+      </w:r>
+      <w:proofErr w:type="spellEnd"/>
+      <w:r>
+        <w:rPr>
+          <w:color w:val="000000"/>
+        </w:rPr>
+        <w:t>. Identify the original data owner and any required third-party permissions, including when a vendor or intermediary supplies the data.</w:t>
       </w:r>
     </w:p>
     <w:p>
@@ -2430,7 +2483,21 @@
           <w:color w:val="000000"/>
         </w:rPr>
         <w:lastRenderedPageBreak/>
-        <w:t>Describe remaining approval steps and any restrictions or fees that could affect open release. Deriving models from images does not by itself establish permission to share them.</w:t>
+        <w:t xml:space="preserve">Describe remaining approval steps and any restrictions or fees that could affect open release. </w:t>
+      </w:r>
+      <w:proofErr w:type="gramStart"/>
+      <w:r>
+        <w:rPr>
+          <w:color w:val="000000"/>
+        </w:rPr>
+        <w:t>Deriving</w:t>
+      </w:r>
+      <w:proofErr w:type="gramEnd"/>
+      <w:r>
+        <w:rPr>
+          <w:color w:val="000000"/>
+        </w:rPr>
+        <w:t xml:space="preserve"> models from images does not by itself establish permission to share them.</w:t>
       </w:r>
     </w:p>
     <w:p>
@@ -2598,7 +2665,21 @@
         <w:rPr>
           <w:color w:val="000000"/>
         </w:rPr>
-        <w:t>Authors to be listed on the planned publications (see Section 11, Contribution Benefits)</w:t>
+        <w:t xml:space="preserve">Authors to be listed </w:t>
+      </w:r>
+      <w:proofErr w:type="gramStart"/>
+      <w:r>
+        <w:rPr>
+          <w:color w:val="000000"/>
+        </w:rPr>
+        <w:t>on</w:t>
+      </w:r>
+      <w:proofErr w:type="gramEnd"/>
+      <w:r>
+        <w:rPr>
+          <w:color w:val="000000"/>
+        </w:rPr>
+        <w:t xml:space="preserve"> the planned publications (see Section 11, Contribution Benefits)</w:t>
       </w:r>
     </w:p>
     <w:p>
@@ -2917,11 +2998,15 @@
       </w:r>
       <w:r>
         <w:tab/>
+      </w:r>
+      <w:proofErr w:type="gramStart"/>
+      <w:r>
         <w:t>August</w:t>
       </w:r>
       <w:r>
         <w:t>,</w:t>
       </w:r>
+      <w:proofErr w:type="gramEnd"/>
       <w:r>
         <w:t xml:space="preserve"> 2027</w:t>
       </w:r>
@@ -2970,7 +3055,21 @@
         <w:rPr>
           <w:color w:val="000000"/>
         </w:rPr>
-        <w:t xml:space="preserve">Academic institutions, start‑ups, and industrial healthcare firms are welcome. </w:t>
+        <w:t xml:space="preserve">Academic institutions, </w:t>
+      </w:r>
+      <w:proofErr w:type="gramStart"/>
+      <w:r>
+        <w:rPr>
+          <w:color w:val="000000"/>
+        </w:rPr>
+        <w:t>start‑ups</w:t>
+      </w:r>
+      <w:proofErr w:type="gramEnd"/>
+      <w:r>
+        <w:rPr>
+          <w:color w:val="000000"/>
+        </w:rPr>
+        <w:t xml:space="preserve">, and industrial healthcare firms are welcome. </w:t>
       </w:r>
     </w:p>
     <w:p>
@@ -3151,7 +3250,21 @@
         <w:rPr>
           <w:color w:val="000000"/>
         </w:rPr>
-        <w:t>Final datasets and model weights will be released under OpenMDW (https://openmdw.ai/). Contributors must hold the rights needed to release each contributed asset under that license. This applies to original images, derived models, simulation outputs, and open-category data.</w:t>
+        <w:t xml:space="preserve">Final datasets and model weights will be released under </w:t>
+      </w:r>
+      <w:proofErr w:type="spellStart"/>
+      <w:r>
+        <w:rPr>
+          <w:color w:val="000000"/>
+        </w:rPr>
+        <w:t>OpenMDW</w:t>
+      </w:r>
+      <w:proofErr w:type="spellEnd"/>
+      <w:r>
+        <w:rPr>
+          <w:color w:val="000000"/>
+        </w:rPr>
+        <w:t xml:space="preserve"> (https://openmdw.ai/). Contributors must hold the rights needed to release each contributed asset under that license. This applies to original images, derived models, simulation outputs, and open-category data.</w:t>
       </w:r>
     </w:p>
     <w:p/>

</xml_diff>

<commit_message>
FIX: Update readme to match CFP (#5)
</commit_message>
<xml_diff>
--- a/docs/Open-H-4D_Call_For_Proposals.docx
+++ b/docs/Open-H-4D_Call_For_Proposals.docx
@@ -579,7 +579,10 @@
         <w:ind w:left="270"/>
       </w:pPr>
       <w:r>
-        <w:t>Jeff Bodner, PhD</w:t>
+        <w:t>Jeff Bodner</w:t>
+      </w:r>
+      <w:r>
+        <w:tab/>
       </w:r>
       <w:r>
         <w:rPr>
@@ -604,7 +607,27 @@
         <w:ind w:left="270"/>
       </w:pPr>
       <w:r>
-        <w:t>Xiaoxiao Li, PhD</w:t>
+        <w:t>Ryan Moore, MD</w:t>
+      </w:r>
+      <w:r>
+        <w:tab/>
+      </w:r>
+      <w:r>
+        <w:tab/>
+        <w:t>Cincinnati Children’s Hospital</w:t>
+      </w:r>
+    </w:p>
+    <w:p>
+      <w:pPr>
+        <w:ind w:left="270"/>
+      </w:pPr>
+      <w:proofErr w:type="spellStart"/>
+      <w:r>
+        <w:t>Xiaoxiao</w:t>
+      </w:r>
+      <w:proofErr w:type="spellEnd"/>
+      <w:r>
+        <w:t xml:space="preserve"> Li, PhD</w:t>
       </w:r>
       <w:r>
         <w:tab/>
@@ -628,9 +651,11 @@
       <w:r>
         <w:t xml:space="preserve">The Open-H-4D dataset and model weights will be publicly available on Hugging Face under the </w:t>
       </w:r>
+      <w:proofErr w:type="spellStart"/>
       <w:r>
         <w:t>OpenMDW</w:t>
       </w:r>
+      <w:proofErr w:type="spellEnd"/>
       <w:r>
         <w:t xml:space="preserve"> license.</w:t>
       </w:r>
@@ -912,7 +937,21 @@
         <w:rPr>
           <w:color w:val="000000"/>
         </w:rPr>
-        <w:t>– Publish cleaned and pre-processed datasets and model weights under OpenMDW, with the first public release targeted for August 2027.</w:t>
+        <w:t xml:space="preserve">– Publish cleaned and pre-processed datasets and model weights under </w:t>
+      </w:r>
+      <w:proofErr w:type="spellStart"/>
+      <w:r>
+        <w:rPr>
+          <w:color w:val="000000"/>
+        </w:rPr>
+        <w:t>OpenMDW</w:t>
+      </w:r>
+      <w:proofErr w:type="spellEnd"/>
+      <w:r>
+        <w:rPr>
+          <w:color w:val="000000"/>
+        </w:rPr>
+        <w:t>, with the first public release targeted for August 2027.</w:t>
       </w:r>
     </w:p>
     <w:p>
@@ -2405,7 +2444,21 @@
         <w:rPr>
           <w:color w:val="000000"/>
         </w:rPr>
-        <w:t>Confirmation that contributed assets can be publicly released for academic and commercial use under OpenMDW. Identify the original data owner and any required third-party permissions, including when a vendor or intermediary supplies the data.</w:t>
+        <w:t xml:space="preserve">Confirmation that contributed assets can be publicly released for academic and commercial use under </w:t>
+      </w:r>
+      <w:proofErr w:type="spellStart"/>
+      <w:r>
+        <w:rPr>
+          <w:color w:val="000000"/>
+        </w:rPr>
+        <w:t>OpenMDW</w:t>
+      </w:r>
+      <w:proofErr w:type="spellEnd"/>
+      <w:r>
+        <w:rPr>
+          <w:color w:val="000000"/>
+        </w:rPr>
+        <w:t>. Identify the original data owner and any required third-party permissions, including when a vendor or intermediary supplies the data.</w:t>
       </w:r>
     </w:p>
     <w:p>
@@ -2430,7 +2483,21 @@
           <w:color w:val="000000"/>
         </w:rPr>
         <w:lastRenderedPageBreak/>
-        <w:t>Describe remaining approval steps and any restrictions or fees that could affect open release. Deriving models from images does not by itself establish permission to share them.</w:t>
+        <w:t xml:space="preserve">Describe remaining approval steps and any restrictions or fees that could affect open release. </w:t>
+      </w:r>
+      <w:proofErr w:type="gramStart"/>
+      <w:r>
+        <w:rPr>
+          <w:color w:val="000000"/>
+        </w:rPr>
+        <w:t>Deriving</w:t>
+      </w:r>
+      <w:proofErr w:type="gramEnd"/>
+      <w:r>
+        <w:rPr>
+          <w:color w:val="000000"/>
+        </w:rPr>
+        <w:t xml:space="preserve"> models from images does not by itself establish permission to share them.</w:t>
       </w:r>
     </w:p>
     <w:p>
@@ -2598,7 +2665,21 @@
         <w:rPr>
           <w:color w:val="000000"/>
         </w:rPr>
-        <w:t>Authors to be listed on the planned publications (see Section 11, Contribution Benefits)</w:t>
+        <w:t xml:space="preserve">Authors to be listed </w:t>
+      </w:r>
+      <w:proofErr w:type="gramStart"/>
+      <w:r>
+        <w:rPr>
+          <w:color w:val="000000"/>
+        </w:rPr>
+        <w:t>on</w:t>
+      </w:r>
+      <w:proofErr w:type="gramEnd"/>
+      <w:r>
+        <w:rPr>
+          <w:color w:val="000000"/>
+        </w:rPr>
+        <w:t xml:space="preserve"> the planned publications (see Section 11, Contribution Benefits)</w:t>
       </w:r>
     </w:p>
     <w:p>
@@ -2917,11 +2998,15 @@
       </w:r>
       <w:r>
         <w:tab/>
+      </w:r>
+      <w:proofErr w:type="gramStart"/>
+      <w:r>
         <w:t>August</w:t>
       </w:r>
       <w:r>
         <w:t>,</w:t>
       </w:r>
+      <w:proofErr w:type="gramEnd"/>
       <w:r>
         <w:t xml:space="preserve"> 2027</w:t>
       </w:r>
@@ -2970,7 +3055,21 @@
         <w:rPr>
           <w:color w:val="000000"/>
         </w:rPr>
-        <w:t xml:space="preserve">Academic institutions, start‑ups, and industrial healthcare firms are welcome. </w:t>
+        <w:t xml:space="preserve">Academic institutions, </w:t>
+      </w:r>
+      <w:proofErr w:type="gramStart"/>
+      <w:r>
+        <w:rPr>
+          <w:color w:val="000000"/>
+        </w:rPr>
+        <w:t>start‑ups</w:t>
+      </w:r>
+      <w:proofErr w:type="gramEnd"/>
+      <w:r>
+        <w:rPr>
+          <w:color w:val="000000"/>
+        </w:rPr>
+        <w:t xml:space="preserve">, and industrial healthcare firms are welcome. </w:t>
       </w:r>
     </w:p>
     <w:p>
@@ -3151,7 +3250,21 @@
         <w:rPr>
           <w:color w:val="000000"/>
         </w:rPr>
-        <w:t>Final datasets and model weights will be released under OpenMDW (https://openmdw.ai/). Contributors must hold the rights needed to release each contributed asset under that license. This applies to original images, derived models, simulation outputs, and open-category data.</w:t>
+        <w:t xml:space="preserve">Final datasets and model weights will be released under </w:t>
+      </w:r>
+      <w:proofErr w:type="spellStart"/>
+      <w:r>
+        <w:rPr>
+          <w:color w:val="000000"/>
+        </w:rPr>
+        <w:t>OpenMDW</w:t>
+      </w:r>
+      <w:proofErr w:type="spellEnd"/>
+      <w:r>
+        <w:rPr>
+          <w:color w:val="000000"/>
+        </w:rPr>
+        <w:t xml:space="preserve"> (https://openmdw.ai/). Contributors must hold the rights needed to release each contributed asset under that license. This applies to original images, derived models, simulation outputs, and open-category data.</w:t>
       </w:r>
     </w:p>
     <w:p/>

</xml_diff>